<commit_message>
docs(production): apply IEEE Access target branding, list sequence resetting, backtick purging, native equation rendering, and IEEE numbered reference style
</commit_message>
<xml_diff>
--- a/docs/paper/Paper_V3_IEEE.docx
+++ b/docs/paper/Paper_V3_IEEE.docx
@@ -74,57 +74,19 @@
           <w:rFonts w:ascii="Times New Roman" w:hAnsi="Times New Roman"/>
           <w:sz w:val="20"/>
         </w:rPr>
-        <w:t xml:space="preserve">: </w:t>
-      </w:r>
-      <w:r>
-        <w:rPr>
-          <w:rFonts w:ascii="Consolas" w:hAnsi="Consolas"/>
-          <w:color w:val="A01E1E"/>
-          <w:sz w:val="19"/>
-        </w:rPr>
-        <w:t>run_1785796639905</w:t>
-      </w:r>
-      <w:r>
-        <w:rPr>
-          <w:rFonts w:ascii="Times New Roman" w:hAnsi="Times New Roman"/>
-          <w:sz w:val="20"/>
-        </w:rPr>
-        <w:t xml:space="preserve"> | Dataset Hash: </w:t>
-      </w:r>
-      <w:r>
-        <w:rPr>
-          <w:rFonts w:ascii="Consolas" w:hAnsi="Consolas"/>
-          <w:color w:val="A01E1E"/>
-          <w:sz w:val="19"/>
-        </w:rPr>
-        <w:t>17c136ef76dd0f82</w:t>
-      </w:r>
-      <w:r>
-        <w:rPr>
-          <w:rFonts w:ascii="Times New Roman" w:hAnsi="Times New Roman"/>
-          <w:sz w:val="20"/>
-        </w:rPr>
-        <w:t xml:space="preserve"> | Commit: </w:t>
-      </w:r>
-      <w:r>
-        <w:rPr>
-          <w:rFonts w:ascii="Consolas" w:hAnsi="Consolas"/>
-          <w:color w:val="A01E1E"/>
-          <w:sz w:val="19"/>
-        </w:rPr>
-        <w:t>823334b</w:t>
+        <w:t>: run_1785796639905 | Dataset Hash: 17c136ef76dd0f82 | Commit: 823334b</w:t>
       </w:r>
     </w:p>
     <w:p>
       <w:pPr>
-        <w:spacing w:before="120" w:after="120"/>
-        <w:jc w:val="center"/>
-      </w:pPr>
-      <w:r>
-        <w:rPr>
-          <w:color w:val="D2D2D2"/>
-        </w:rPr>
-        <w:t>_________________________________________________________________________________</w:t>
+        <w:spacing w:before="40" w:after="80" w:line="276" w:lineRule="auto"/>
+      </w:pPr>
+      <w:r>
+        <w:rPr>
+          <w:rFonts w:ascii="Times New Roman" w:hAnsi="Times New Roman"/>
+          <w:sz w:val="20"/>
+        </w:rPr>
+        <w:t>---</w:t>
       </w:r>
     </w:p>
     <w:p>
@@ -241,22 +203,7 @@
           <w:rFonts w:ascii="Times New Roman" w:hAnsi="Times New Roman"/>
           <w:sz w:val="20"/>
         </w:rPr>
-        <w:t>). To isolate genuine recognition failures from superficial string variations, the evaluation subsystem incorporates a six-stage semantic canonical normalizer (</w:t>
-      </w:r>
-      <w:r>
-        <w:rPr>
-          <w:rFonts w:ascii="Consolas" w:hAnsi="Consolas"/>
-          <w:color w:val="A01E1E"/>
-          <w:sz w:val="19"/>
-        </w:rPr>
-        <w:t>CanonicalNormalizer</w:t>
-      </w:r>
-      <w:r>
-        <w:rPr>
-          <w:rFonts w:ascii="Times New Roman" w:hAnsi="Times New Roman"/>
-          <w:sz w:val="20"/>
-        </w:rPr>
-        <w:t>) and an automated nine-class structured OCR error taxonomy.</w:t>
+        <w:t>). To isolate genuine recognition failures from superficial string variations, the evaluation subsystem incorporates a six-stage semantic canonical normalizer (CanonicalNormalizer) and an automated nine-class structured OCR error taxonomy.</w:t>
       </w:r>
     </w:p>
     <w:p>
@@ -284,22 +231,7 @@
           <w:rFonts w:ascii="Times New Roman" w:hAnsi="Times New Roman"/>
           <w:sz w:val="20"/>
         </w:rPr>
-        <w:t>). In headless framework validation dry-runs, the evaluation subsystem achieved a processing throughput of 242.59 samples/sec with zero database state mutations. In live neural model inference testing using Groq Cloud's Llama 3.1 8B Instant engine with strict real-inference enforcement (</w:t>
-      </w:r>
-      <w:r>
-        <w:rPr>
-          <w:rFonts w:ascii="Consolas" w:hAnsi="Consolas"/>
-          <w:color w:val="A01E1E"/>
-          <w:sz w:val="19"/>
-        </w:rPr>
-        <w:t>allowMockFallback: false</w:t>
-      </w:r>
-      <w:r>
-        <w:rPr>
-          <w:rFonts w:ascii="Times New Roman" w:hAnsi="Times New Roman"/>
-          <w:sz w:val="20"/>
-        </w:rPr>
-        <w:t xml:space="preserve">), the system achieved a </w:t>
+        <w:t xml:space="preserve">). In headless framework validation dry-runs, the evaluation subsystem achieved a processing throughput of 242.59 samples/sec with zero database state mutations. In live neural model inference testing using Groq Cloud's Llama 3.1 8B Instant engine with strict real-inference enforcement (allowMockFallback: false), the system achieved a </w:t>
       </w:r>
       <w:r>
         <w:rPr>
@@ -354,14 +286,14 @@
     </w:p>
     <w:p>
       <w:pPr>
-        <w:spacing w:before="120" w:after="120"/>
-        <w:jc w:val="center"/>
-      </w:pPr>
-      <w:r>
-        <w:rPr>
-          <w:color w:val="D2D2D2"/>
-        </w:rPr>
-        <w:t>_________________________________________________________________________________</w:t>
+        <w:spacing w:before="40" w:after="80" w:line="276" w:lineRule="auto"/>
+      </w:pPr>
+      <w:r>
+        <w:rPr>
+          <w:rFonts w:ascii="Times New Roman" w:hAnsi="Times New Roman"/>
+          <w:sz w:val="20"/>
+        </w:rPr>
+        <w:t>---</w:t>
       </w:r>
     </w:p>
     <w:p>
@@ -420,9 +352,17 @@
     </w:p>
     <w:p>
       <w:pPr>
-        <w:pStyle w:val="ListNumber"/>
         <w:spacing w:before="20" w:after="40"/>
-      </w:pPr>
+        <w:ind w:left="360"/>
+      </w:pPr>
+      <w:r>
+        <w:rPr>
+          <w:rFonts w:ascii="Times New Roman" w:hAnsi="Times New Roman"/>
+          <w:b/>
+          <w:sz w:val="20"/>
+        </w:rPr>
+        <w:t xml:space="preserve">1. </w:t>
+      </w:r>
       <w:r>
         <w:rPr>
           <w:rFonts w:ascii="Times New Roman" w:hAnsi="Times New Roman"/>
@@ -441,9 +381,17 @@
     </w:p>
     <w:p>
       <w:pPr>
-        <w:pStyle w:val="ListNumber"/>
         <w:spacing w:before="20" w:after="40"/>
-      </w:pPr>
+        <w:ind w:left="360"/>
+      </w:pPr>
+      <w:r>
+        <w:rPr>
+          <w:rFonts w:ascii="Times New Roman" w:hAnsi="Times New Roman"/>
+          <w:b/>
+          <w:sz w:val="20"/>
+        </w:rPr>
+        <w:t xml:space="preserve">2. </w:t>
+      </w:r>
       <w:r>
         <w:rPr>
           <w:rFonts w:ascii="Times New Roman" w:hAnsi="Times New Roman"/>
@@ -462,8 +410,8 @@
     </w:p>
     <w:p>
       <w:pPr>
-        <w:pStyle w:val="ListNumber"/>
         <w:spacing w:before="20" w:after="40"/>
+        <w:ind w:left="360"/>
       </w:pPr>
       <w:r>
         <w:rPr>
@@ -471,6 +419,14 @@
           <w:b/>
           <w:sz w:val="20"/>
         </w:rPr>
+        <w:t xml:space="preserve">3. </w:t>
+      </w:r>
+      <w:r>
+        <w:rPr>
+          <w:rFonts w:ascii="Times New Roman" w:hAnsi="Times New Roman"/>
+          <w:b/>
+          <w:sz w:val="20"/>
+        </w:rPr>
         <w:t>Superficial Formatting Discrepancies</w:t>
       </w:r>
       <w:r>
@@ -478,37 +434,7 @@
           <w:rFonts w:ascii="Times New Roman" w:hAnsi="Times New Roman"/>
           <w:sz w:val="20"/>
         </w:rPr>
-        <w:t xml:space="preserve">: Standard string comparison metrics (e.g., raw string matching) incorrectly penalize minor formatting variations (e.g., </w:t>
-      </w:r>
-      <w:r>
-        <w:rPr>
-          <w:rFonts w:ascii="Times New Roman" w:hAnsi="Times New Roman"/>
-          <w:color w:val="A01E1E"/>
-          <w:sz w:val="20"/>
-        </w:rPr>
-        <w:t>2026-08-04</w:t>
-      </w:r>
-      <w:r>
-        <w:rPr>
-          <w:rFonts w:ascii="Times New Roman" w:hAnsi="Times New Roman"/>
-          <w:sz w:val="20"/>
-        </w:rPr>
-        <w:t xml:space="preserve"> vs </w:t>
-      </w:r>
-      <w:r>
-        <w:rPr>
-          <w:rFonts w:ascii="Times New Roman" w:hAnsi="Times New Roman"/>
-          <w:color w:val="A01E1E"/>
-          <w:sz w:val="20"/>
-        </w:rPr>
-        <w:t>August 4, 2026</w:t>
-      </w:r>
-      <w:r>
-        <w:rPr>
-          <w:rFonts w:ascii="Times New Roman" w:hAnsi="Times New Roman"/>
-          <w:sz w:val="20"/>
-        </w:rPr>
-        <w:t>), distorting extraction accuracy evaluations.</w:t>
+        <w:t>: Standard string comparison metrics (e.g., raw string matching) incorrectly penalize minor formatting variations (e.g., 2026-08-04 vs August 4, 2026), distorting extraction accuracy evaluations.</w:t>
       </w:r>
     </w:p>
     <w:p>
@@ -630,9 +556,17 @@
     </w:p>
     <w:p>
       <w:pPr>
-        <w:pStyle w:val="ListNumber"/>
         <w:spacing w:before="20" w:after="40"/>
-      </w:pPr>
+        <w:ind w:left="360"/>
+      </w:pPr>
+      <w:r>
+        <w:rPr>
+          <w:rFonts w:ascii="Times New Roman" w:hAnsi="Times New Roman"/>
+          <w:b/>
+          <w:sz w:val="20"/>
+        </w:rPr>
+        <w:t xml:space="preserve">1. </w:t>
+      </w:r>
       <w:r>
         <w:rPr>
           <w:rFonts w:ascii="Times New Roman" w:hAnsi="Times New Roman"/>
@@ -696,9 +630,17 @@
     </w:p>
     <w:p>
       <w:pPr>
-        <w:pStyle w:val="ListNumber"/>
         <w:spacing w:before="20" w:after="40"/>
-      </w:pPr>
+        <w:ind w:left="360"/>
+      </w:pPr>
+      <w:r>
+        <w:rPr>
+          <w:rFonts w:ascii="Times New Roman" w:hAnsi="Times New Roman"/>
+          <w:b/>
+          <w:sz w:val="20"/>
+        </w:rPr>
+        <w:t xml:space="preserve">2. </w:t>
+      </w:r>
       <w:r>
         <w:rPr>
           <w:rFonts w:ascii="Times New Roman" w:hAnsi="Times New Roman"/>
@@ -717,8 +659,8 @@
     </w:p>
     <w:p>
       <w:pPr>
-        <w:pStyle w:val="ListNumber"/>
         <w:spacing w:before="20" w:after="40"/>
+        <w:ind w:left="360"/>
       </w:pPr>
       <w:r>
         <w:rPr>
@@ -726,6 +668,14 @@
           <w:b/>
           <w:sz w:val="20"/>
         </w:rPr>
+        <w:t xml:space="preserve">3. </w:t>
+      </w:r>
+      <w:r>
+        <w:rPr>
+          <w:rFonts w:ascii="Times New Roman" w:hAnsi="Times New Roman"/>
+          <w:b/>
+          <w:sz w:val="20"/>
+        </w:rPr>
         <w:t>Six-Stage Semantic Normalization Layer</w:t>
       </w:r>
       <w:r>
@@ -733,28 +683,13 @@
           <w:rFonts w:ascii="Times New Roman" w:hAnsi="Times New Roman"/>
           <w:sz w:val="20"/>
         </w:rPr>
-        <w:t>: A canonical field normalizer (</w:t>
-      </w:r>
-      <w:r>
-        <w:rPr>
-          <w:rFonts w:ascii="Times New Roman" w:hAnsi="Times New Roman"/>
-          <w:color w:val="A01E1E"/>
-          <w:sz w:val="20"/>
-        </w:rPr>
-        <w:t>CanonicalNormalizer</w:t>
-      </w:r>
-      <w:r>
-        <w:rPr>
-          <w:rFonts w:ascii="Times New Roman" w:hAnsi="Times New Roman"/>
-          <w:sz w:val="20"/>
-        </w:rPr>
-        <w:t>) that standardizes dates, roll numbers, numerical grades, degree titles, and institution aliases prior to metric calculation.</w:t>
+        <w:t>: A canonical field normalizer (CanonicalNormalizer) that standardizes dates, roll numbers, numerical grades, degree titles, and institution aliases prior to metric calculation.</w:t>
       </w:r>
     </w:p>
     <w:p>
       <w:pPr>
-        <w:pStyle w:val="ListNumber"/>
         <w:spacing w:before="20" w:after="40"/>
+        <w:ind w:left="360"/>
       </w:pPr>
       <w:r>
         <w:rPr>
@@ -762,6 +697,14 @@
           <w:b/>
           <w:sz w:val="20"/>
         </w:rPr>
+        <w:t xml:space="preserve">4. </w:t>
+      </w:r>
+      <w:r>
+        <w:rPr>
+          <w:rFonts w:ascii="Times New Roman" w:hAnsi="Times New Roman"/>
+          <w:b/>
+          <w:sz w:val="20"/>
+        </w:rPr>
         <w:t>Nine-Class Structured OCR Error Taxonomy</w:t>
       </w:r>
       <w:r>
@@ -769,73 +712,13 @@
           <w:rFonts w:ascii="Times New Roman" w:hAnsi="Times New Roman"/>
           <w:sz w:val="20"/>
         </w:rPr>
-        <w:t>: An automated error categorization module that classifies field extraction failures into distinct diagnostic categories (</w:t>
-      </w:r>
-      <w:r>
-        <w:rPr>
-          <w:rFonts w:ascii="Times New Roman" w:hAnsi="Times New Roman"/>
-          <w:color w:val="A01E1E"/>
-          <w:sz w:val="20"/>
-        </w:rPr>
-        <w:t>OCR_ERROR</w:t>
-      </w:r>
-      <w:r>
-        <w:rPr>
-          <w:rFonts w:ascii="Times New Roman" w:hAnsi="Times New Roman"/>
-          <w:sz w:val="20"/>
-        </w:rPr>
-        <w:t xml:space="preserve">, </w:t>
-      </w:r>
-      <w:r>
-        <w:rPr>
-          <w:rFonts w:ascii="Times New Roman" w:hAnsi="Times New Roman"/>
-          <w:color w:val="A01E1E"/>
-          <w:sz w:val="20"/>
-        </w:rPr>
-        <w:t>FIELD_MISSING</w:t>
-      </w:r>
-      <w:r>
-        <w:rPr>
-          <w:rFonts w:ascii="Times New Roman" w:hAnsi="Times New Roman"/>
-          <w:sz w:val="20"/>
-        </w:rPr>
-        <w:t xml:space="preserve">, </w:t>
-      </w:r>
-      <w:r>
-        <w:rPr>
-          <w:rFonts w:ascii="Times New Roman" w:hAnsi="Times New Roman"/>
-          <w:color w:val="A01E1E"/>
-          <w:sz w:val="20"/>
-        </w:rPr>
-        <w:t>HALLUCINATION</w:t>
-      </w:r>
-      <w:r>
-        <w:rPr>
-          <w:rFonts w:ascii="Times New Roman" w:hAnsi="Times New Roman"/>
-          <w:sz w:val="20"/>
-        </w:rPr>
-        <w:t xml:space="preserve">, </w:t>
-      </w:r>
-      <w:r>
-        <w:rPr>
-          <w:rFonts w:ascii="Times New Roman" w:hAnsi="Times New Roman"/>
-          <w:color w:val="A01E1E"/>
-          <w:sz w:val="20"/>
-        </w:rPr>
-        <w:t>FORMAT_ERROR</w:t>
-      </w:r>
-      <w:r>
-        <w:rPr>
-          <w:rFonts w:ascii="Times New Roman" w:hAnsi="Times New Roman"/>
-          <w:sz w:val="20"/>
-        </w:rPr>
-        <w:t>, etc.).</w:t>
+        <w:t>: An automated error categorization module that classifies field extraction failures into distinct diagnostic categories (OCR_ERROR, FIELD_MISSING, HALLUCINATION, FORMAT_ERROR, etc.).</w:t>
       </w:r>
     </w:p>
     <w:p>
       <w:pPr>
-        <w:pStyle w:val="ListNumber"/>
         <w:spacing w:before="20" w:after="40"/>
+        <w:ind w:left="360"/>
       </w:pPr>
       <w:r>
         <w:rPr>
@@ -843,6 +726,14 @@
           <w:b/>
           <w:sz w:val="20"/>
         </w:rPr>
+        <w:t xml:space="preserve">5. </w:t>
+      </w:r>
+      <w:r>
+        <w:rPr>
+          <w:rFonts w:ascii="Times New Roman" w:hAnsi="Times New Roman"/>
+          <w:b/>
+          <w:sz w:val="20"/>
+        </w:rPr>
         <w:t>Quality Profile Robustness Framework</w:t>
       </w:r>
       <w:r>
@@ -850,67 +741,7 @@
           <w:rFonts w:ascii="Times New Roman" w:hAnsi="Times New Roman"/>
           <w:sz w:val="20"/>
         </w:rPr>
-        <w:t>: A systematic evaluation matrix measuring extraction decay across four standardized optical profiles (</w:t>
-      </w:r>
-      <w:r>
-        <w:rPr>
-          <w:rFonts w:ascii="Times New Roman" w:hAnsi="Times New Roman"/>
-          <w:color w:val="A01E1E"/>
-          <w:sz w:val="20"/>
-        </w:rPr>
-        <w:t>clean</w:t>
-      </w:r>
-      <w:r>
-        <w:rPr>
-          <w:rFonts w:ascii="Times New Roman" w:hAnsi="Times New Roman"/>
-          <w:sz w:val="20"/>
-        </w:rPr>
-        <w:t xml:space="preserve">, </w:t>
-      </w:r>
-      <w:r>
-        <w:rPr>
-          <w:rFonts w:ascii="Times New Roman" w:hAnsi="Times New Roman"/>
-          <w:color w:val="A01E1E"/>
-          <w:sz w:val="20"/>
-        </w:rPr>
-        <w:t>scanner_copy</w:t>
-      </w:r>
-      <w:r>
-        <w:rPr>
-          <w:rFonts w:ascii="Times New Roman" w:hAnsi="Times New Roman"/>
-          <w:sz w:val="20"/>
-        </w:rPr>
-        <w:t xml:space="preserve">, </w:t>
-      </w:r>
-      <w:r>
-        <w:rPr>
-          <w:rFonts w:ascii="Times New Roman" w:hAnsi="Times New Roman"/>
-          <w:color w:val="A01E1E"/>
-          <w:sz w:val="20"/>
-        </w:rPr>
-        <w:t>mobile_camera</w:t>
-      </w:r>
-      <w:r>
-        <w:rPr>
-          <w:rFonts w:ascii="Times New Roman" w:hAnsi="Times New Roman"/>
-          <w:sz w:val="20"/>
-        </w:rPr>
-        <w:t xml:space="preserve">, </w:t>
-      </w:r>
-      <w:r>
-        <w:rPr>
-          <w:rFonts w:ascii="Times New Roman" w:hAnsi="Times New Roman"/>
-          <w:color w:val="A01E1E"/>
-          <w:sz w:val="20"/>
-        </w:rPr>
-        <w:t>rotated_90</w:t>
-      </w:r>
-      <w:r>
-        <w:rPr>
-          <w:rFonts w:ascii="Times New Roman" w:hAnsi="Times New Roman"/>
-          <w:sz w:val="20"/>
-        </w:rPr>
-        <w:t>).</w:t>
+        <w:t>: A systematic evaluation matrix measuring extraction decay across four standardized optical profiles (clean, scanner_copy, mobile_camera, rotated_90).</w:t>
       </w:r>
     </w:p>
     <w:p>
@@ -942,14 +773,14 @@
     </w:p>
     <w:p>
       <w:pPr>
-        <w:spacing w:before="120" w:after="120"/>
-        <w:jc w:val="center"/>
-      </w:pPr>
-      <w:r>
-        <w:rPr>
-          <w:color w:val="D2D2D2"/>
-        </w:rPr>
-        <w:t>_________________________________________________________________________________</w:t>
+        <w:spacing w:before="40" w:after="80" w:line="276" w:lineRule="auto"/>
+      </w:pPr>
+      <w:r>
+        <w:rPr>
+          <w:rFonts w:ascii="Times New Roman" w:hAnsi="Times New Roman"/>
+          <w:sz w:val="20"/>
+        </w:rPr>
+        <w:t>---</w:t>
       </w:r>
     </w:p>
     <w:p>
@@ -2428,14 +2259,14 @@
     </w:p>
     <w:p>
       <w:pPr>
-        <w:spacing w:before="120" w:after="120"/>
-        <w:jc w:val="center"/>
-      </w:pPr>
-      <w:r>
-        <w:rPr>
-          <w:color w:val="D2D2D2"/>
-        </w:rPr>
-        <w:t>_________________________________________________________________________________</w:t>
+        <w:spacing w:before="40" w:after="80" w:line="276" w:lineRule="auto"/>
+      </w:pPr>
+      <w:r>
+        <w:rPr>
+          <w:rFonts w:ascii="Times New Roman" w:hAnsi="Times New Roman"/>
+          <w:sz w:val="20"/>
+        </w:rPr>
+        <w:t>---</w:t>
       </w:r>
     </w:p>
     <w:p>
@@ -2552,14 +2383,14 @@
     </w:p>
     <w:p>
       <w:pPr>
-        <w:spacing w:before="120" w:after="120"/>
-        <w:jc w:val="center"/>
-      </w:pPr>
-      <w:r>
-        <w:rPr>
-          <w:color w:val="D2D2D2"/>
-        </w:rPr>
-        <w:t>_________________________________________________________________________________</w:t>
+        <w:spacing w:before="40" w:after="80" w:line="276" w:lineRule="auto"/>
+      </w:pPr>
+      <w:r>
+        <w:rPr>
+          <w:rFonts w:ascii="Times New Roman" w:hAnsi="Times New Roman"/>
+          <w:sz w:val="20"/>
+        </w:rPr>
+        <w:t>---</w:t>
       </w:r>
     </w:p>
     <w:p>
@@ -2601,22 +2432,7 @@
           <w:rFonts w:ascii="Times New Roman" w:hAnsi="Times New Roman"/>
           <w:sz w:val="20"/>
         </w:rPr>
-        <w:t>ADBG v1.0 generates synthetic document profiles using a pseudo-random seed generator (</w:t>
-      </w:r>
-      <w:r>
-        <w:rPr>
-          <w:rFonts w:ascii="Consolas" w:hAnsi="Consolas"/>
-          <w:color w:val="A01E1E"/>
-          <w:sz w:val="19"/>
-        </w:rPr>
-        <w:t>PrngSeedGenerator</w:t>
-      </w:r>
-      <w:r>
-        <w:rPr>
-          <w:rFonts w:ascii="Times New Roman" w:hAnsi="Times New Roman"/>
-          <w:sz w:val="20"/>
-        </w:rPr>
-        <w:t>). Seed initialization ensures that identical seed parameters produce identical document text, field layout coordinates, and visual degradation artifacts across runs:</w:t>
+        <w:t>ADBG v1.0 generates synthetic document profiles using a pseudo-random seed generator (PrngSeedGenerator). Seed initialization ensures that identical seed parameters produce identical document text, field layout coordinates, and visual degradation artifacts across runs:</w:t>
       </w:r>
     </w:p>
     <w:p>
@@ -2658,29 +2474,22 @@
           <w:rFonts w:ascii="Times New Roman" w:hAnsi="Times New Roman"/>
           <w:sz w:val="20"/>
         </w:rPr>
-        <w:t>The generator utilizes a Typst vector compilation backend (</w:t>
-      </w:r>
-      <w:r>
-        <w:rPr>
-          <w:rFonts w:ascii="Consolas" w:hAnsi="Consolas"/>
-          <w:color w:val="A01E1E"/>
-          <w:sz w:val="19"/>
-        </w:rPr>
-        <w:t>TypstCompilerAdapter</w:t>
-      </w:r>
-      <w:r>
-        <w:rPr>
-          <w:rFonts w:ascii="Times New Roman" w:hAnsi="Times New Roman"/>
-          <w:sz w:val="20"/>
-        </w:rPr>
-        <w:t>) to render high-resolution academic documents. Three primary document categories are supported:</w:t>
+        <w:t>The generator utilizes a Typst vector compilation backend (TypstCompilerAdapter) to render high-resolution academic documents. Three primary document categories are supported:</w:t>
       </w:r>
     </w:p>
     <w:p>
       <w:pPr>
-        <w:pStyle w:val="ListNumber"/>
         <w:spacing w:before="20" w:after="40"/>
-      </w:pPr>
+        <w:ind w:left="360"/>
+      </w:pPr>
+      <w:r>
+        <w:rPr>
+          <w:rFonts w:ascii="Times New Roman" w:hAnsi="Times New Roman"/>
+          <w:b/>
+          <w:sz w:val="20"/>
+        </w:rPr>
+        <w:t xml:space="preserve">1. </w:t>
+      </w:r>
       <w:r>
         <w:rPr>
           <w:rFonts w:ascii="Times New Roman" w:hAnsi="Times New Roman"/>
@@ -2699,9 +2508,17 @@
     </w:p>
     <w:p>
       <w:pPr>
-        <w:pStyle w:val="ListNumber"/>
         <w:spacing w:before="20" w:after="40"/>
-      </w:pPr>
+        <w:ind w:left="360"/>
+      </w:pPr>
+      <w:r>
+        <w:rPr>
+          <w:rFonts w:ascii="Times New Roman" w:hAnsi="Times New Roman"/>
+          <w:b/>
+          <w:sz w:val="20"/>
+        </w:rPr>
+        <w:t xml:space="preserve">2. </w:t>
+      </w:r>
       <w:r>
         <w:rPr>
           <w:rFonts w:ascii="Times New Roman" w:hAnsi="Times New Roman"/>
@@ -2720,9 +2537,17 @@
     </w:p>
     <w:p>
       <w:pPr>
-        <w:pStyle w:val="ListNumber"/>
         <w:spacing w:before="20" w:after="40"/>
-      </w:pPr>
+        <w:ind w:left="360"/>
+      </w:pPr>
+      <w:r>
+        <w:rPr>
+          <w:rFonts w:ascii="Times New Roman" w:hAnsi="Times New Roman"/>
+          <w:b/>
+          <w:sz w:val="20"/>
+        </w:rPr>
+        <w:t xml:space="preserve">3. </w:t>
+      </w:r>
       <w:r>
         <w:rPr>
           <w:rFonts w:ascii="Times New Roman" w:hAnsi="Times New Roman"/>
@@ -2790,22 +2615,7 @@
           <w:rFonts w:ascii="Times New Roman" w:hAnsi="Times New Roman"/>
           <w:sz w:val="20"/>
         </w:rPr>
-        <w:t xml:space="preserve">Four standard quality profiles are instantiated in </w:t>
-      </w:r>
-      <w:r>
-        <w:rPr>
-          <w:rFonts w:ascii="Consolas" w:hAnsi="Consolas"/>
-          <w:color w:val="A01E1E"/>
-          <w:sz w:val="19"/>
-        </w:rPr>
-        <w:t>AU_DIC_Benchmark_v1.0</w:t>
-      </w:r>
-      <w:r>
-        <w:rPr>
-          <w:rFonts w:ascii="Times New Roman" w:hAnsi="Times New Roman"/>
-          <w:sz w:val="20"/>
-        </w:rPr>
-        <w:t>:</w:t>
+        <w:t>Four standard quality profiles are instantiated in AU_DIC_Benchmark_v1.0:</w:t>
       </w:r>
     </w:p>
     <w:p>
@@ -2819,7 +2629,7 @@
           <w:b/>
           <w:sz w:val="20"/>
         </w:rPr>
-        <w:t>`clean`</w:t>
+        <w:t>clean</w:t>
       </w:r>
       <w:r>
         <w:rPr>
@@ -2840,7 +2650,7 @@
           <w:b/>
           <w:sz w:val="20"/>
         </w:rPr>
-        <w:t>`scanner_copy`</w:t>
+        <w:t>scanner_copy</w:t>
       </w:r>
       <w:r>
         <w:rPr>
@@ -2861,7 +2671,7 @@
           <w:b/>
           <w:sz w:val="20"/>
         </w:rPr>
-        <w:t>`mobile_camera`</w:t>
+        <w:t>mobile_camera</w:t>
       </w:r>
       <w:r>
         <w:rPr>
@@ -2882,7 +2692,7 @@
           <w:b/>
           <w:sz w:val="20"/>
         </w:rPr>
-        <w:t>`rotated_90`</w:t>
+        <w:t>rotated_90</w:t>
       </w:r>
       <w:r>
         <w:rPr>
@@ -2894,14 +2704,14 @@
     </w:p>
     <w:p>
       <w:pPr>
-        <w:spacing w:before="120" w:after="120"/>
-        <w:jc w:val="center"/>
-      </w:pPr>
-      <w:r>
-        <w:rPr>
-          <w:color w:val="D2D2D2"/>
-        </w:rPr>
-        <w:t>_________________________________________________________________________________</w:t>
+        <w:spacing w:before="40" w:after="80" w:line="276" w:lineRule="auto"/>
+      </w:pPr>
+      <w:r>
+        <w:rPr>
+          <w:rFonts w:ascii="Times New Roman" w:hAnsi="Times New Roman"/>
+          <w:sz w:val="20"/>
+        </w:rPr>
+        <w:t>---</w:t>
       </w:r>
     </w:p>
     <w:p>
@@ -2943,52 +2753,7 @@
           <w:rFonts w:ascii="Times New Roman" w:hAnsi="Times New Roman"/>
           <w:sz w:val="20"/>
         </w:rPr>
-        <w:t>The benchmark runner (</w:t>
-      </w:r>
-      <w:r>
-        <w:rPr>
-          <w:rFonts w:ascii="Consolas" w:hAnsi="Consolas"/>
-          <w:color w:val="A01E1E"/>
-          <w:sz w:val="19"/>
-        </w:rPr>
-        <w:t>BenchmarkRunner</w:t>
-      </w:r>
-      <w:r>
-        <w:rPr>
-          <w:rFonts w:ascii="Times New Roman" w:hAnsi="Times New Roman"/>
-          <w:sz w:val="20"/>
-        </w:rPr>
-        <w:t>) operates strictly in read-only mode (</w:t>
-      </w:r>
-      <w:r>
-        <w:rPr>
-          <w:rFonts w:ascii="Consolas" w:hAnsi="Consolas"/>
-          <w:color w:val="A01E1E"/>
-          <w:sz w:val="19"/>
-        </w:rPr>
-        <w:t>isReadOnly: true</w:t>
-      </w:r>
-      <w:r>
-        <w:rPr>
-          <w:rFonts w:ascii="Times New Roman" w:hAnsi="Times New Roman"/>
-          <w:sz w:val="20"/>
-        </w:rPr>
-        <w:t xml:space="preserve">). It ingests document image specimens and ground-truth JSON files from </w:t>
-      </w:r>
-      <w:r>
-        <w:rPr>
-          <w:rFonts w:ascii="Consolas" w:hAnsi="Consolas"/>
-          <w:color w:val="A01E1E"/>
-          <w:sz w:val="19"/>
-        </w:rPr>
-        <w:t>AU_DIC_Benchmark_v1.0</w:t>
-      </w:r>
-      <w:r>
-        <w:rPr>
-          <w:rFonts w:ascii="Times New Roman" w:hAnsi="Times New Roman"/>
-          <w:sz w:val="20"/>
-        </w:rPr>
-        <w:t>, invokes document analysis prediction adapters, and computes evaluation metrics in memory without executing write operations on production databases.</w:t>
+        <w:t>The benchmark runner (BenchmarkRunner) operates strictly in read-only mode (isReadOnly: true). It ingests document image specimens and ground-truth JSON files from AU_DIC_Benchmark_v1.0, invokes document analysis prediction adapters, and computes evaluation metrics in memory without executing write operations on production databases.</w:t>
       </w:r>
     </w:p>
     <w:p>
@@ -3015,29 +2780,22 @@
           <w:rFonts w:ascii="Times New Roman" w:hAnsi="Times New Roman"/>
           <w:sz w:val="20"/>
         </w:rPr>
-        <w:t>Raw text extracted by OCR models often contains superficial formatting variations (e.g., date formatting, whitespace padding, numerical precision differences) that cause standard string equality metrics to return false negative errors. To isolate genuine recognition failures, the framework routes predicted and expected string values through a six-stage semantic normalizer (</w:t>
-      </w:r>
-      <w:r>
-        <w:rPr>
-          <w:rFonts w:ascii="Consolas" w:hAnsi="Consolas"/>
-          <w:color w:val="A01E1E"/>
-          <w:sz w:val="19"/>
-        </w:rPr>
-        <w:t>CanonicalNormalizer</w:t>
-      </w:r>
-      <w:r>
-        <w:rPr>
-          <w:rFonts w:ascii="Times New Roman" w:hAnsi="Times New Roman"/>
-          <w:sz w:val="20"/>
-        </w:rPr>
-        <w:t>):</w:t>
+        <w:t>Raw text extracted by OCR models often contains superficial formatting variations (e.g., date formatting, whitespace padding, numerical precision differences) that cause standard string equality metrics to return false negative errors. To isolate genuine recognition failures, the framework routes predicted and expected string values through a six-stage semantic normalizer (CanonicalNormalizer):</w:t>
       </w:r>
     </w:p>
     <w:p>
       <w:pPr>
-        <w:pStyle w:val="ListNumber"/>
         <w:spacing w:before="20" w:after="40"/>
-      </w:pPr>
+        <w:ind w:left="360"/>
+      </w:pPr>
+      <w:r>
+        <w:rPr>
+          <w:rFonts w:ascii="Times New Roman" w:hAnsi="Times New Roman"/>
+          <w:b/>
+          <w:sz w:val="20"/>
+        </w:rPr>
+        <w:t xml:space="preserve">1. </w:t>
+      </w:r>
       <w:r>
         <w:rPr>
           <w:rFonts w:ascii="Times New Roman" w:hAnsi="Times New Roman"/>
@@ -3056,8 +2814,8 @@
     </w:p>
     <w:p>
       <w:pPr>
-        <w:pStyle w:val="ListNumber"/>
         <w:spacing w:before="20" w:after="40"/>
+        <w:ind w:left="360"/>
       </w:pPr>
       <w:r>
         <w:rPr>
@@ -3065,6 +2823,14 @@
           <w:b/>
           <w:sz w:val="20"/>
         </w:rPr>
+        <w:t xml:space="preserve">2. </w:t>
+      </w:r>
+      <w:r>
+        <w:rPr>
+          <w:rFonts w:ascii="Times New Roman" w:hAnsi="Times New Roman"/>
+          <w:b/>
+          <w:sz w:val="20"/>
+        </w:rPr>
         <w:t>Stage 2: ISO Date Canonicalization</w:t>
       </w:r>
       <w:r>
@@ -3072,74 +2838,22 @@
           <w:rFonts w:ascii="Times New Roman" w:hAnsi="Times New Roman"/>
           <w:sz w:val="20"/>
         </w:rPr>
-        <w:t>: Standardizes diverse date formats (</w:t>
-      </w:r>
-      <w:r>
-        <w:rPr>
-          <w:rFonts w:ascii="Times New Roman" w:hAnsi="Times New Roman"/>
-          <w:color w:val="A01E1E"/>
-          <w:sz w:val="20"/>
-        </w:rPr>
-        <w:t>04/08/2026</w:t>
-      </w:r>
-      <w:r>
-        <w:rPr>
-          <w:rFonts w:ascii="Times New Roman" w:hAnsi="Times New Roman"/>
-          <w:sz w:val="20"/>
-        </w:rPr>
-        <w:t xml:space="preserve">, </w:t>
-      </w:r>
-      <w:r>
-        <w:rPr>
-          <w:rFonts w:ascii="Times New Roman" w:hAnsi="Times New Roman"/>
-          <w:color w:val="A01E1E"/>
-          <w:sz w:val="20"/>
-        </w:rPr>
-        <w:t>August 4, 2026</w:t>
-      </w:r>
-      <w:r>
-        <w:rPr>
-          <w:rFonts w:ascii="Times New Roman" w:hAnsi="Times New Roman"/>
-          <w:sz w:val="20"/>
-        </w:rPr>
-        <w:t xml:space="preserve">, </w:t>
-      </w:r>
-      <w:r>
-        <w:rPr>
-          <w:rFonts w:ascii="Times New Roman" w:hAnsi="Times New Roman"/>
-          <w:color w:val="A01E1E"/>
-          <w:sz w:val="20"/>
-        </w:rPr>
-        <w:t>2026.08.04</w:t>
-      </w:r>
-      <w:r>
-        <w:rPr>
-          <w:rFonts w:ascii="Times New Roman" w:hAnsi="Times New Roman"/>
-          <w:sz w:val="20"/>
-        </w:rPr>
-        <w:t>) into ISO-8601 string representations (</w:t>
-      </w:r>
-      <w:r>
-        <w:rPr>
-          <w:rFonts w:ascii="Times New Roman" w:hAnsi="Times New Roman"/>
-          <w:color w:val="A01E1E"/>
-          <w:sz w:val="20"/>
-        </w:rPr>
-        <w:t>YYYY-MM-DD</w:t>
-      </w:r>
-      <w:r>
-        <w:rPr>
-          <w:rFonts w:ascii="Times New Roman" w:hAnsi="Times New Roman"/>
-          <w:sz w:val="20"/>
-        </w:rPr>
-        <w:t>).</w:t>
+        <w:t>: Standardizes diverse date formats (04/08/2026, August 4, 2026, 2026.08.04) into ISO-8601 string representations (YYYY-MM-DD).</w:t>
       </w:r>
     </w:p>
     <w:p>
       <w:pPr>
-        <w:pStyle w:val="ListNumber"/>
         <w:spacing w:before="20" w:after="40"/>
-      </w:pPr>
+        <w:ind w:left="360"/>
+      </w:pPr>
+      <w:r>
+        <w:rPr>
+          <w:rFonts w:ascii="Times New Roman" w:hAnsi="Times New Roman"/>
+          <w:b/>
+          <w:sz w:val="20"/>
+        </w:rPr>
+        <w:t xml:space="preserve">3. </w:t>
+      </w:r>
       <w:r>
         <w:rPr>
           <w:rFonts w:ascii="Times New Roman" w:hAnsi="Times New Roman"/>
@@ -3158,9 +2872,17 @@
     </w:p>
     <w:p>
       <w:pPr>
-        <w:pStyle w:val="ListNumber"/>
         <w:spacing w:before="20" w:after="40"/>
-      </w:pPr>
+        <w:ind w:left="360"/>
+      </w:pPr>
+      <w:r>
+        <w:rPr>
+          <w:rFonts w:ascii="Times New Roman" w:hAnsi="Times New Roman"/>
+          <w:b/>
+          <w:sz w:val="20"/>
+        </w:rPr>
+        <w:t xml:space="preserve">4. </w:t>
+      </w:r>
       <w:r>
         <w:rPr>
           <w:rFonts w:ascii="Times New Roman" w:hAnsi="Times New Roman"/>
@@ -3179,8 +2901,8 @@
     </w:p>
     <w:p>
       <w:pPr>
-        <w:pStyle w:val="ListNumber"/>
         <w:spacing w:before="20" w:after="40"/>
+        <w:ind w:left="360"/>
       </w:pPr>
       <w:r>
         <w:rPr>
@@ -3188,6 +2910,14 @@
           <w:b/>
           <w:sz w:val="20"/>
         </w:rPr>
+        <w:t xml:space="preserve">5. </w:t>
+      </w:r>
+      <w:r>
+        <w:rPr>
+          <w:rFonts w:ascii="Times New Roman" w:hAnsi="Times New Roman"/>
+          <w:b/>
+          <w:sz w:val="20"/>
+        </w:rPr>
         <w:t>Stage 5: Institutional Alias Mapping</w:t>
       </w:r>
       <w:r>
@@ -3195,22 +2925,7 @@
           <w:rFonts w:ascii="Times New Roman" w:hAnsi="Times New Roman"/>
           <w:sz w:val="20"/>
         </w:rPr>
-        <w:t xml:space="preserve">: Maps common university name abbreviations (e.g., </w:t>
-      </w:r>
-      <w:r>
-        <w:rPr>
-          <w:rFonts w:ascii="Times New Roman" w:hAnsi="Times New Roman"/>
-          <w:color w:val="A01E1E"/>
-          <w:sz w:val="20"/>
-        </w:rPr>
-        <w:t>MIT</w:t>
-      </w:r>
-      <w:r>
-        <w:rPr>
-          <w:rFonts w:ascii="Times New Roman" w:hAnsi="Times New Roman"/>
-          <w:sz w:val="20"/>
-        </w:rPr>
-        <w:t xml:space="preserve"> </w:t>
+        <w:t xml:space="preserve">: Maps common university name abbreviations (e.g., MIT </w:t>
       </w:r>
       <w:r>
         <w:rPr>
@@ -3226,28 +2941,13 @@
           <w:rFonts w:ascii="Times New Roman" w:hAnsi="Times New Roman"/>
           <w:sz w:val="20"/>
         </w:rPr>
-        <w:t xml:space="preserve"> </w:t>
-      </w:r>
-      <w:r>
-        <w:rPr>
-          <w:rFonts w:ascii="Times New Roman" w:hAnsi="Times New Roman"/>
-          <w:color w:val="A01E1E"/>
-          <w:sz w:val="20"/>
-        </w:rPr>
-        <w:t>Massachusetts Institute of Technology</w:t>
-      </w:r>
-      <w:r>
-        <w:rPr>
-          <w:rFonts w:ascii="Times New Roman" w:hAnsi="Times New Roman"/>
-          <w:sz w:val="20"/>
-        </w:rPr>
-        <w:t>) using an institutional lexicon directory.</w:t>
+        <w:t xml:space="preserve"> Massachusetts Institute of Technology) using an institutional lexicon directory.</w:t>
       </w:r>
     </w:p>
     <w:p>
       <w:pPr>
-        <w:pStyle w:val="ListNumber"/>
         <w:spacing w:before="20" w:after="40"/>
+        <w:ind w:left="360"/>
       </w:pPr>
       <w:r>
         <w:rPr>
@@ -3255,6 +2955,14 @@
           <w:b/>
           <w:sz w:val="20"/>
         </w:rPr>
+        <w:t xml:space="preserve">6. </w:t>
+      </w:r>
+      <w:r>
+        <w:rPr>
+          <w:rFonts w:ascii="Times New Roman" w:hAnsi="Times New Roman"/>
+          <w:b/>
+          <w:sz w:val="20"/>
+        </w:rPr>
         <w:t>Stage 6: Canonical Honorific Removal</w:t>
       </w:r>
       <w:r>
@@ -3262,67 +2970,7 @@
           <w:rFonts w:ascii="Times New Roman" w:hAnsi="Times New Roman"/>
           <w:sz w:val="20"/>
         </w:rPr>
-        <w:t>: Removes standard honorific prefixes (</w:t>
-      </w:r>
-      <w:r>
-        <w:rPr>
-          <w:rFonts w:ascii="Times New Roman" w:hAnsi="Times New Roman"/>
-          <w:color w:val="A01E1E"/>
-          <w:sz w:val="20"/>
-        </w:rPr>
-        <w:t>Mr.</w:t>
-      </w:r>
-      <w:r>
-        <w:rPr>
-          <w:rFonts w:ascii="Times New Roman" w:hAnsi="Times New Roman"/>
-          <w:sz w:val="20"/>
-        </w:rPr>
-        <w:t xml:space="preserve">, </w:t>
-      </w:r>
-      <w:r>
-        <w:rPr>
-          <w:rFonts w:ascii="Times New Roman" w:hAnsi="Times New Roman"/>
-          <w:color w:val="A01E1E"/>
-          <w:sz w:val="20"/>
-        </w:rPr>
-        <w:t>Ms.</w:t>
-      </w:r>
-      <w:r>
-        <w:rPr>
-          <w:rFonts w:ascii="Times New Roman" w:hAnsi="Times New Roman"/>
-          <w:sz w:val="20"/>
-        </w:rPr>
-        <w:t xml:space="preserve">, </w:t>
-      </w:r>
-      <w:r>
-        <w:rPr>
-          <w:rFonts w:ascii="Times New Roman" w:hAnsi="Times New Roman"/>
-          <w:color w:val="A01E1E"/>
-          <w:sz w:val="20"/>
-        </w:rPr>
-        <w:t>Dr.</w:t>
-      </w:r>
-      <w:r>
-        <w:rPr>
-          <w:rFonts w:ascii="Times New Roman" w:hAnsi="Times New Roman"/>
-          <w:sz w:val="20"/>
-        </w:rPr>
-        <w:t xml:space="preserve">, </w:t>
-      </w:r>
-      <w:r>
-        <w:rPr>
-          <w:rFonts w:ascii="Times New Roman" w:hAnsi="Times New Roman"/>
-          <w:color w:val="A01E1E"/>
-          <w:sz w:val="20"/>
-        </w:rPr>
-        <w:t>Prof.</w:t>
-      </w:r>
-      <w:r>
-        <w:rPr>
-          <w:rFonts w:ascii="Times New Roman" w:hAnsi="Times New Roman"/>
-          <w:sz w:val="20"/>
-        </w:rPr>
-        <w:t>) prior to candidate name comparison.</w:t>
+        <w:t>: Removes standard honorific prefixes (Mr., Ms., Dr., Prof.) prior to candidate name comparison.</w:t>
       </w:r>
     </w:p>
     <w:p>
@@ -3369,14 +3017,14 @@
     </w:p>
     <w:p>
       <w:pPr>
-        <w:spacing w:before="120" w:after="120"/>
-        <w:jc w:val="center"/>
-      </w:pPr>
-      <w:r>
-        <w:rPr>
-          <w:color w:val="D2D2D2"/>
-        </w:rPr>
-        <w:t>_________________________________________________________________________________</w:t>
+        <w:spacing w:before="40" w:after="80" w:line="276" w:lineRule="auto"/>
+      </w:pPr>
+      <w:r>
+        <w:rPr>
+          <w:rFonts w:ascii="Times New Roman" w:hAnsi="Times New Roman"/>
+          <w:sz w:val="20"/>
+        </w:rPr>
+        <w:t>---</w:t>
       </w:r>
     </w:p>
     <w:p>
@@ -3406,7 +3054,7 @@
           <w:color w:val="333333"/>
           <w:sz w:val="23"/>
         </w:rPr>
-        <w:t>6.1 Dataset Composition (`AU_DIC_Benchmark_v1.0`)</w:t>
+        <w:t>6.1 Dataset Composition (AU_DIC_Benchmark_v1.0)</w:t>
       </w:r>
     </w:p>
     <w:p>
@@ -3512,9 +3160,17 @@
     </w:p>
     <w:p>
       <w:pPr>
-        <w:pStyle w:val="ListNumber"/>
         <w:spacing w:before="20" w:after="40"/>
-      </w:pPr>
+        <w:ind w:left="360"/>
+      </w:pPr>
+      <w:r>
+        <w:rPr>
+          <w:rFonts w:ascii="Times New Roman" w:hAnsi="Times New Roman"/>
+          <w:b/>
+          <w:sz w:val="20"/>
+        </w:rPr>
+        <w:t xml:space="preserve">1. </w:t>
+      </w:r>
       <w:r>
         <w:rPr>
           <w:rFonts w:ascii="Times New Roman" w:hAnsi="Times New Roman"/>
@@ -3621,9 +3277,17 @@
     </w:p>
     <w:p>
       <w:pPr>
-        <w:pStyle w:val="ListNumber"/>
         <w:spacing w:before="20" w:after="40"/>
-      </w:pPr>
+        <w:ind w:left="360"/>
+      </w:pPr>
+      <w:r>
+        <w:rPr>
+          <w:rFonts w:ascii="Times New Roman" w:hAnsi="Times New Roman"/>
+          <w:b/>
+          <w:sz w:val="20"/>
+        </w:rPr>
+        <w:t xml:space="preserve">2. </w:t>
+      </w:r>
       <w:r>
         <w:rPr>
           <w:rFonts w:ascii="Times New Roman" w:hAnsi="Times New Roman"/>
@@ -3700,9 +3364,17 @@
     </w:p>
     <w:p>
       <w:pPr>
-        <w:pStyle w:val="ListNumber"/>
         <w:spacing w:before="20" w:after="40"/>
-      </w:pPr>
+        <w:ind w:left="360"/>
+      </w:pPr>
+      <w:r>
+        <w:rPr>
+          <w:rFonts w:ascii="Times New Roman" w:hAnsi="Times New Roman"/>
+          <w:b/>
+          <w:sz w:val="20"/>
+        </w:rPr>
+        <w:t xml:space="preserve">3. </w:t>
+      </w:r>
       <w:r>
         <w:rPr>
           <w:rFonts w:ascii="Times New Roman" w:hAnsi="Times New Roman"/>
@@ -3765,9 +3437,17 @@
     </w:p>
     <w:p>
       <w:pPr>
-        <w:pStyle w:val="ListNumber"/>
         <w:spacing w:before="20" w:after="40"/>
-      </w:pPr>
+        <w:ind w:left="360"/>
+      </w:pPr>
+      <w:r>
+        <w:rPr>
+          <w:rFonts w:ascii="Times New Roman" w:hAnsi="Times New Roman"/>
+          <w:b/>
+          <w:sz w:val="20"/>
+        </w:rPr>
+        <w:t xml:space="preserve">4. </w:t>
+      </w:r>
       <w:r>
         <w:rPr>
           <w:rFonts w:ascii="Times New Roman" w:hAnsi="Times New Roman"/>
@@ -3830,9 +3510,17 @@
     </w:p>
     <w:p>
       <w:pPr>
-        <w:pStyle w:val="ListNumber"/>
         <w:spacing w:before="20" w:after="40"/>
-      </w:pPr>
+        <w:ind w:left="360"/>
+      </w:pPr>
+      <w:r>
+        <w:rPr>
+          <w:rFonts w:ascii="Times New Roman" w:hAnsi="Times New Roman"/>
+          <w:b/>
+          <w:sz w:val="20"/>
+        </w:rPr>
+        <w:t xml:space="preserve">5. </w:t>
+      </w:r>
       <w:r>
         <w:rPr>
           <w:rFonts w:ascii="Times New Roman" w:hAnsi="Times New Roman"/>
@@ -3851,9 +3539,17 @@
     </w:p>
     <w:p>
       <w:pPr>
-        <w:pStyle w:val="ListNumber"/>
         <w:spacing w:before="20" w:after="40"/>
-      </w:pPr>
+        <w:ind w:left="360"/>
+      </w:pPr>
+      <w:r>
+        <w:rPr>
+          <w:rFonts w:ascii="Times New Roman" w:hAnsi="Times New Roman"/>
+          <w:b/>
+          <w:sz w:val="20"/>
+        </w:rPr>
+        <w:t xml:space="preserve">6. </w:t>
+      </w:r>
       <w:r>
         <w:rPr>
           <w:rFonts w:ascii="Times New Roman" w:hAnsi="Times New Roman"/>
@@ -3904,14 +3600,14 @@
     </w:p>
     <w:p>
       <w:pPr>
-        <w:spacing w:before="120" w:after="120"/>
-        <w:jc w:val="center"/>
-      </w:pPr>
-      <w:r>
-        <w:rPr>
-          <w:color w:val="D2D2D2"/>
-        </w:rPr>
-        <w:t>_________________________________________________________________________________</w:t>
+        <w:spacing w:before="40" w:after="80" w:line="276" w:lineRule="auto"/>
+      </w:pPr>
+      <w:r>
+        <w:rPr>
+          <w:rFonts w:ascii="Times New Roman" w:hAnsi="Times New Roman"/>
+          <w:sz w:val="20"/>
+        </w:rPr>
+        <w:t>---</w:t>
       </w:r>
     </w:p>
     <w:p>
@@ -3958,9 +3654,17 @@
     </w:p>
     <w:p>
       <w:pPr>
-        <w:pStyle w:val="ListNumber"/>
         <w:spacing w:before="20" w:after="40"/>
-      </w:pPr>
+        <w:ind w:left="360"/>
+      </w:pPr>
+      <w:r>
+        <w:rPr>
+          <w:rFonts w:ascii="Times New Roman" w:hAnsi="Times New Roman"/>
+          <w:b/>
+          <w:sz w:val="20"/>
+        </w:rPr>
+        <w:t xml:space="preserve">1. </w:t>
+      </w:r>
       <w:r>
         <w:rPr>
           <w:rFonts w:ascii="Times New Roman" w:hAnsi="Times New Roman"/>
@@ -3979,8 +3683,8 @@
     </w:p>
     <w:p>
       <w:pPr>
-        <w:pStyle w:val="ListNumber"/>
         <w:spacing w:before="20" w:after="40"/>
+        <w:ind w:left="360"/>
       </w:pPr>
       <w:r>
         <w:rPr>
@@ -3988,6 +3692,14 @@
           <w:b/>
           <w:sz w:val="20"/>
         </w:rPr>
+        <w:t xml:space="preserve">2. </w:t>
+      </w:r>
+      <w:r>
+        <w:rPr>
+          <w:rFonts w:ascii="Times New Roman" w:hAnsi="Times New Roman"/>
+          <w:b/>
+          <w:sz w:val="20"/>
+        </w:rPr>
         <w:t>Benchmark Integrity Validation (Verified)</w:t>
       </w:r>
       <w:r>
@@ -3995,29 +3707,22 @@
           <w:rFonts w:ascii="Times New Roman" w:hAnsi="Times New Roman"/>
           <w:sz w:val="20"/>
         </w:rPr>
-        <w:t>: Confirms zero ground truth leakage and verifies that comparators correctly detect character typos, missing fields, and category mismatches in controlled tests (</w:t>
-      </w:r>
-      <w:r>
-        <w:rPr>
-          <w:rFonts w:ascii="Times New Roman" w:hAnsi="Times New Roman"/>
-          <w:color w:val="A01E1E"/>
-          <w:sz w:val="20"/>
-        </w:rPr>
-        <w:t>validationAudit.test.ts</w:t>
-      </w:r>
-      <w:r>
-        <w:rPr>
-          <w:rFonts w:ascii="Times New Roman" w:hAnsi="Times New Roman"/>
-          <w:sz w:val="20"/>
-        </w:rPr>
-        <w:t>).</w:t>
+        <w:t>: Confirms zero ground truth leakage and verifies that comparators correctly detect character typos, missing fields, and category mismatches in controlled tests (validationAudit.test.ts).</w:t>
       </w:r>
     </w:p>
     <w:p>
       <w:pPr>
-        <w:pStyle w:val="ListNumber"/>
         <w:spacing w:before="20" w:after="40"/>
-      </w:pPr>
+        <w:ind w:left="360"/>
+      </w:pPr>
+      <w:r>
+        <w:rPr>
+          <w:rFonts w:ascii="Times New Roman" w:hAnsi="Times New Roman"/>
+          <w:b/>
+          <w:sz w:val="20"/>
+        </w:rPr>
+        <w:t xml:space="preserve">3. </w:t>
+      </w:r>
       <w:r>
         <w:rPr>
           <w:rFonts w:ascii="Times New Roman" w:hAnsi="Times New Roman"/>
@@ -4058,22 +3763,7 @@
           <w:rFonts w:ascii="Times New Roman" w:hAnsi="Times New Roman"/>
           <w:sz w:val="20"/>
         </w:rPr>
-        <w:t>Table 1 summarizes the framework system verification metrics evaluated across the 360 benchmark specimens (</w:t>
-      </w:r>
-      <w:r>
-        <w:rPr>
-          <w:rFonts w:ascii="Consolas" w:hAnsi="Consolas"/>
-          <w:color w:val="A01E1E"/>
-          <w:sz w:val="19"/>
-        </w:rPr>
-        <w:t>AU_DIC_Benchmark_v1.0</w:t>
-      </w:r>
-      <w:r>
-        <w:rPr>
-          <w:rFonts w:ascii="Times New Roman" w:hAnsi="Times New Roman"/>
-          <w:sz w:val="20"/>
-        </w:rPr>
-        <w:t>).</w:t>
+        <w:t>Table 1 summarizes the framework system verification metrics evaluated across the 360 benchmark specimens (AU_DIC_Benchmark_v1.0).</w:t>
       </w:r>
     </w:p>
     <w:p>
@@ -4357,7 +4047,7 @@
                 <w:b/>
                 <w:sz w:val="18"/>
               </w:rPr>
-              <w:t>`clean`</w:t>
+              <w:t>clean</w:t>
             </w:r>
           </w:p>
         </w:tc>
@@ -4560,7 +4250,7 @@
                 <w:b/>
                 <w:sz w:val="18"/>
               </w:rPr>
-              <w:t>`scanner_copy`</w:t>
+              <w:t>scanner_copy</w:t>
             </w:r>
           </w:p>
         </w:tc>
@@ -4763,7 +4453,7 @@
                 <w:b/>
                 <w:sz w:val="18"/>
               </w:rPr>
-              <w:t>`mobile_camera`</w:t>
+              <w:t>mobile_camera</w:t>
             </w:r>
           </w:p>
         </w:tc>
@@ -4966,7 +4656,7 @@
                 <w:b/>
                 <w:sz w:val="18"/>
               </w:rPr>
-              <w:t>`rotated_90`</w:t>
+              <w:t>rotated_90</w:t>
             </w:r>
           </w:p>
         </w:tc>
@@ -5584,97 +5274,7 @@
           <w:rFonts w:ascii="Times New Roman" w:hAnsi="Times New Roman"/>
           <w:sz w:val="20"/>
         </w:rPr>
-        <w:t>To evaluate live neural document analysis performance without mock fallbacks (</w:t>
-      </w:r>
-      <w:r>
-        <w:rPr>
-          <w:rFonts w:ascii="Consolas" w:hAnsi="Consolas"/>
-          <w:color w:val="A01E1E"/>
-          <w:sz w:val="19"/>
-        </w:rPr>
-        <w:t>allowMockFallback: false</w:t>
-      </w:r>
-      <w:r>
-        <w:rPr>
-          <w:rFonts w:ascii="Times New Roman" w:hAnsi="Times New Roman"/>
-          <w:sz w:val="20"/>
-        </w:rPr>
-        <w:t xml:space="preserve">), the benchmark runner executed full inference across all 360 specimens using </w:t>
-      </w:r>
-      <w:r>
-        <w:rPr>
-          <w:rFonts w:ascii="Consolas" w:hAnsi="Consolas"/>
-          <w:color w:val="A01E1E"/>
-          <w:sz w:val="19"/>
-        </w:rPr>
-        <w:t>Groq Cloud Llama 3.1 8B Instant</w:t>
-      </w:r>
-      <w:r>
-        <w:rPr>
-          <w:rFonts w:ascii="Times New Roman" w:hAnsi="Times New Roman"/>
-          <w:sz w:val="20"/>
-        </w:rPr>
-        <w:t xml:space="preserve"> (</w:t>
-      </w:r>
-      <w:r>
-        <w:rPr>
-          <w:rFonts w:ascii="Consolas" w:hAnsi="Consolas"/>
-          <w:color w:val="A01E1E"/>
-          <w:sz w:val="19"/>
-        </w:rPr>
-        <w:t>run_1785796639905</w:t>
-      </w:r>
-      <w:r>
-        <w:rPr>
-          <w:rFonts w:ascii="Times New Roman" w:hAnsi="Times New Roman"/>
-          <w:sz w:val="20"/>
-        </w:rPr>
-        <w:t>). Every prediction recorded complete provenance metadata (</w:t>
-      </w:r>
-      <w:r>
-        <w:rPr>
-          <w:rFonts w:ascii="Consolas" w:hAnsi="Consolas"/>
-          <w:color w:val="A01E1E"/>
-          <w:sz w:val="19"/>
-        </w:rPr>
-        <w:t>isMock: false</w:t>
-      </w:r>
-      <w:r>
-        <w:rPr>
-          <w:rFonts w:ascii="Times New Roman" w:hAnsi="Times New Roman"/>
-          <w:sz w:val="20"/>
-        </w:rPr>
-        <w:t xml:space="preserve">, </w:t>
-      </w:r>
-      <w:r>
-        <w:rPr>
-          <w:rFonts w:ascii="Consolas" w:hAnsi="Consolas"/>
-          <w:color w:val="A01E1E"/>
-          <w:sz w:val="19"/>
-        </w:rPr>
-        <w:t>modelName: llama-3.1-8b-instant</w:t>
-      </w:r>
-      <w:r>
-        <w:rPr>
-          <w:rFonts w:ascii="Times New Roman" w:hAnsi="Times New Roman"/>
-          <w:sz w:val="20"/>
-        </w:rPr>
-        <w:t xml:space="preserve">, </w:t>
-      </w:r>
-      <w:r>
-        <w:rPr>
-          <w:rFonts w:ascii="Consolas" w:hAnsi="Consolas"/>
-          <w:color w:val="A01E1E"/>
-          <w:sz w:val="19"/>
-        </w:rPr>
-        <w:t>requestId</w:t>
-      </w:r>
-      <w:r>
-        <w:rPr>
-          <w:rFonts w:ascii="Times New Roman" w:hAnsi="Times New Roman"/>
-          <w:sz w:val="20"/>
-        </w:rPr>
-        <w:t>).</w:t>
+        <w:t>To evaluate live neural document analysis performance without mock fallbacks (allowMockFallback: false), the benchmark runner executed full inference across all 360 specimens using Groq Cloud Llama 3.1 8B Instant (run_1785796639905). Every prediction recorded complete provenance metadata (isMock: false, modelName: llama-3.1-8b-instant, requestId).</w:t>
       </w:r>
     </w:p>
     <w:p>
@@ -6110,7 +5710,7 @@
                 <w:b/>
                 <w:sz w:val="18"/>
               </w:rPr>
-              <w:t>`clean`</w:t>
+              <w:t>clean</w:t>
             </w:r>
           </w:p>
         </w:tc>
@@ -6338,7 +5938,7 @@
                 <w:b/>
                 <w:sz w:val="18"/>
               </w:rPr>
-              <w:t>`scanner_copy`</w:t>
+              <w:t>scanner_copy</w:t>
             </w:r>
           </w:p>
         </w:tc>
@@ -6566,7 +6166,7 @@
                 <w:b/>
                 <w:sz w:val="18"/>
               </w:rPr>
-              <w:t>`mobile_camera`</w:t>
+              <w:t>mobile_camera</w:t>
             </w:r>
           </w:p>
         </w:tc>
@@ -6794,7 +6394,7 @@
                 <w:b/>
                 <w:sz w:val="18"/>
               </w:rPr>
-              <w:t>`rotated_90`</w:t>
+              <w:t>rotated_90</w:t>
             </w:r>
           </w:p>
         </w:tc>
@@ -7258,9 +6858,17 @@
     </w:p>
     <w:p>
       <w:pPr>
-        <w:pStyle w:val="ListNumber"/>
         <w:spacing w:before="20" w:after="40"/>
-      </w:pPr>
+        <w:ind w:left="360"/>
+      </w:pPr>
+      <w:r>
+        <w:rPr>
+          <w:rFonts w:ascii="Times New Roman" w:hAnsi="Times New Roman"/>
+          <w:b/>
+          <w:sz w:val="20"/>
+        </w:rPr>
+        <w:t xml:space="preserve">1. </w:t>
+      </w:r>
       <w:r>
         <w:rPr>
           <w:rFonts w:ascii="Times New Roman" w:hAnsi="Times New Roman"/>
@@ -7279,8 +6887,8 @@
     </w:p>
     <w:p>
       <w:pPr>
-        <w:pStyle w:val="ListNumber"/>
         <w:spacing w:before="20" w:after="40"/>
+        <w:ind w:left="360"/>
       </w:pPr>
       <w:r>
         <w:rPr>
@@ -7288,6 +6896,14 @@
           <w:b/>
           <w:sz w:val="20"/>
         </w:rPr>
+        <w:t xml:space="preserve">2. </w:t>
+      </w:r>
+      <w:r>
+        <w:rPr>
+          <w:rFonts w:ascii="Times New Roman" w:hAnsi="Times New Roman"/>
+          <w:b/>
+          <w:sz w:val="20"/>
+        </w:rPr>
         <w:t>Document Category Classification Task (66.67% Category Accuracy)</w:t>
       </w:r>
       <w:r>
@@ -7295,74 +6911,22 @@
           <w:rFonts w:ascii="Times New Roman" w:hAnsi="Times New Roman"/>
           <w:sz w:val="20"/>
         </w:rPr>
-        <w:t xml:space="preserve">: The empirical evaluation uncovered a prompt-level schema constraint failure mode. Academic Certificates (120/120) and Marksheets (120/120) achieved 100% classification accuracy. However, because </w:t>
-      </w:r>
-      <w:r>
-        <w:rPr>
-          <w:rFonts w:ascii="Times New Roman" w:hAnsi="Times New Roman"/>
-          <w:color w:val="A01E1E"/>
-          <w:sz w:val="20"/>
-        </w:rPr>
-        <w:t>STUDENT_ID</w:t>
-      </w:r>
-      <w:r>
-        <w:rPr>
-          <w:rFonts w:ascii="Times New Roman" w:hAnsi="Times New Roman"/>
-          <w:sz w:val="20"/>
-        </w:rPr>
-        <w:t xml:space="preserve"> was omitted from the prompt's </w:t>
-      </w:r>
-      <w:r>
-        <w:rPr>
-          <w:rFonts w:ascii="Times New Roman" w:hAnsi="Times New Roman"/>
-          <w:color w:val="A01E1E"/>
-          <w:sz w:val="20"/>
-        </w:rPr>
-        <w:t>ALLOWED_CATEGORIES</w:t>
-      </w:r>
-      <w:r>
-        <w:rPr>
-          <w:rFonts w:ascii="Times New Roman" w:hAnsi="Times New Roman"/>
-          <w:sz w:val="20"/>
-        </w:rPr>
-        <w:t xml:space="preserve"> list, the model strictly mapped Student ID cards (120/120) to </w:t>
-      </w:r>
-      <w:r>
-        <w:rPr>
-          <w:rFonts w:ascii="Times New Roman" w:hAnsi="Times New Roman"/>
-          <w:color w:val="A01E1E"/>
-          <w:sz w:val="20"/>
-        </w:rPr>
-        <w:t>CERTIFICATE</w:t>
-      </w:r>
-      <w:r>
-        <w:rPr>
-          <w:rFonts w:ascii="Times New Roman" w:hAnsi="Times New Roman"/>
-          <w:sz w:val="20"/>
-        </w:rPr>
-        <w:t xml:space="preserve"> (119/120) and </w:t>
-      </w:r>
-      <w:r>
-        <w:rPr>
-          <w:rFonts w:ascii="Times New Roman" w:hAnsi="Times New Roman"/>
-          <w:color w:val="A01E1E"/>
-          <w:sz w:val="20"/>
-        </w:rPr>
-        <w:t>MARKSHEET</w:t>
-      </w:r>
-      <w:r>
-        <w:rPr>
-          <w:rFonts w:ascii="Times New Roman" w:hAnsi="Times New Roman"/>
-          <w:sz w:val="20"/>
-        </w:rPr>
-        <w:t xml:space="preserve"> (1/120).</w:t>
+        <w:t>: The empirical evaluation uncovered a prompt-level schema constraint failure mode. Academic Certificates (120/120) and Marksheets (120/120) achieved 100% classification accuracy. However, because STUDENT_ID was omitted from the prompt's ALLOWED_CATEGORIES list, the model strictly mapped Student ID cards (120/120) to CERTIFICATE (119/120) and MARKSHEET (1/120).</w:t>
       </w:r>
     </w:p>
     <w:p>
       <w:pPr>
-        <w:pStyle w:val="ListNumber"/>
         <w:spacing w:before="20" w:after="40"/>
-      </w:pPr>
+        <w:ind w:left="360"/>
+      </w:pPr>
+      <w:r>
+        <w:rPr>
+          <w:rFonts w:ascii="Times New Roman" w:hAnsi="Times New Roman"/>
+          <w:b/>
+          <w:sz w:val="20"/>
+        </w:rPr>
+        <w:t xml:space="preserve">3. </w:t>
+      </w:r>
       <w:r>
         <w:rPr>
           <w:rFonts w:ascii="Times New Roman" w:hAnsi="Times New Roman"/>
@@ -7381,14 +6945,14 @@
     </w:p>
     <w:p>
       <w:pPr>
-        <w:spacing w:before="120" w:after="120"/>
-        <w:jc w:val="center"/>
-      </w:pPr>
-      <w:r>
-        <w:rPr>
-          <w:color w:val="D2D2D2"/>
-        </w:rPr>
-        <w:t>_________________________________________________________________________________</w:t>
+        <w:spacing w:before="40" w:after="80" w:line="276" w:lineRule="auto"/>
+      </w:pPr>
+      <w:r>
+        <w:rPr>
+          <w:rFonts w:ascii="Times New Roman" w:hAnsi="Times New Roman"/>
+          <w:sz w:val="20"/>
+        </w:rPr>
+        <w:t>---</w:t>
       </w:r>
     </w:p>
     <w:p>
@@ -7423,9 +6987,17 @@
     </w:p>
     <w:p>
       <w:pPr>
-        <w:pStyle w:val="ListNumber"/>
         <w:spacing w:before="20" w:after="40"/>
-      </w:pPr>
+        <w:ind w:left="360"/>
+      </w:pPr>
+      <w:r>
+        <w:rPr>
+          <w:rFonts w:ascii="Times New Roman" w:hAnsi="Times New Roman"/>
+          <w:b/>
+          <w:sz w:val="20"/>
+        </w:rPr>
+        <w:t xml:space="preserve">1. </w:t>
+      </w:r>
       <w:r>
         <w:rPr>
           <w:rFonts w:ascii="Times New Roman" w:hAnsi="Times New Roman"/>
@@ -7444,9 +7016,17 @@
     </w:p>
     <w:p>
       <w:pPr>
-        <w:pStyle w:val="ListNumber"/>
         <w:spacing w:before="20" w:after="40"/>
-      </w:pPr>
+        <w:ind w:left="360"/>
+      </w:pPr>
+      <w:r>
+        <w:rPr>
+          <w:rFonts w:ascii="Times New Roman" w:hAnsi="Times New Roman"/>
+          <w:b/>
+          <w:sz w:val="20"/>
+        </w:rPr>
+        <w:t xml:space="preserve">2. </w:t>
+      </w:r>
       <w:r>
         <w:rPr>
           <w:rFonts w:ascii="Times New Roman" w:hAnsi="Times New Roman"/>
@@ -7496,22 +7076,7 @@
           <w:rFonts w:ascii="Times New Roman" w:hAnsi="Times New Roman"/>
           <w:sz w:val="20"/>
         </w:rPr>
-        <w:t xml:space="preserve">: Verified by confirming that </w:t>
-      </w:r>
-      <w:r>
-        <w:rPr>
-          <w:rFonts w:ascii="Times New Roman" w:hAnsi="Times New Roman"/>
-          <w:color w:val="A01E1E"/>
-          <w:sz w:val="20"/>
-        </w:rPr>
-        <w:t>AuDicPredictionAdapter</w:t>
-      </w:r>
-      <w:r>
-        <w:rPr>
-          <w:rFonts w:ascii="Times New Roman" w:hAnsi="Times New Roman"/>
-          <w:sz w:val="20"/>
-        </w:rPr>
-        <w:t xml:space="preserve"> reads specimen images/text without accessing ground truth JSON dictionaries, eliminating ground truth leakage.</w:t>
+        <w:t>: Verified by confirming that AuDicPredictionAdapter reads specimen images/text without accessing ground truth JSON dictionaries, eliminating ground truth leakage.</w:t>
       </w:r>
     </w:p>
     <w:p>
@@ -7573,9 +7138,17 @@
     </w:p>
     <w:p>
       <w:pPr>
-        <w:pStyle w:val="ListNumber"/>
         <w:spacing w:before="20" w:after="40"/>
-      </w:pPr>
+        <w:ind w:left="360"/>
+      </w:pPr>
+      <w:r>
+        <w:rPr>
+          <w:rFonts w:ascii="Times New Roman" w:hAnsi="Times New Roman"/>
+          <w:b/>
+          <w:sz w:val="20"/>
+        </w:rPr>
+        <w:t xml:space="preserve">1. </w:t>
+      </w:r>
       <w:r>
         <w:rPr>
           <w:rFonts w:ascii="Times New Roman" w:hAnsi="Times New Roman"/>
@@ -7594,8 +7167,8 @@
     </w:p>
     <w:p>
       <w:pPr>
-        <w:pStyle w:val="ListNumber"/>
         <w:spacing w:before="20" w:after="40"/>
+        <w:ind w:left="360"/>
       </w:pPr>
       <w:r>
         <w:rPr>
@@ -7603,6 +7176,14 @@
           <w:b/>
           <w:sz w:val="20"/>
         </w:rPr>
+        <w:t xml:space="preserve">2. </w:t>
+      </w:r>
+      <w:r>
+        <w:rPr>
+          <w:rFonts w:ascii="Times New Roman" w:hAnsi="Times New Roman"/>
+          <w:b/>
+          <w:sz w:val="20"/>
+        </w:rPr>
         <w:t>Language Scope</w:t>
       </w:r>
       <w:r>
@@ -7610,34 +7191,19 @@
           <w:rFonts w:ascii="Times New Roman" w:hAnsi="Times New Roman"/>
           <w:sz w:val="20"/>
         </w:rPr>
-        <w:t>: ADBG v1.0 is currently restricted to English (</w:t>
-      </w:r>
-      <w:r>
-        <w:rPr>
-          <w:rFonts w:ascii="Times New Roman" w:hAnsi="Times New Roman"/>
-          <w:color w:val="A01E1E"/>
-          <w:sz w:val="20"/>
-        </w:rPr>
-        <w:t>en_IN</w:t>
-      </w:r>
-      <w:r>
-        <w:rPr>
-          <w:rFonts w:ascii="Times New Roman" w:hAnsi="Times New Roman"/>
-          <w:sz w:val="20"/>
-        </w:rPr>
-        <w:t>). Multi-lingual documents containing Indic scripts (Hindi, Tamil, Devanagari) are reserved for future releases.</w:t>
+        <w:t>: ADBG v1.0 is currently restricted to English (en_IN). Multi-lingual documents containing Indic scripts (Hindi, Tamil, Devanagari) are reserved for future releases.</w:t>
       </w:r>
     </w:p>
     <w:p>
       <w:pPr>
-        <w:spacing w:before="120" w:after="120"/>
-        <w:jc w:val="center"/>
-      </w:pPr>
-      <w:r>
-        <w:rPr>
-          <w:color w:val="D2D2D2"/>
-        </w:rPr>
-        <w:t>_________________________________________________________________________________</w:t>
+        <w:spacing w:before="40" w:after="80" w:line="276" w:lineRule="auto"/>
+      </w:pPr>
+      <w:r>
+        <w:rPr>
+          <w:rFonts w:ascii="Times New Roman" w:hAnsi="Times New Roman"/>
+          <w:sz w:val="20"/>
+        </w:rPr>
+        <w:t>---</w:t>
       </w:r>
     </w:p>
     <w:p>
@@ -7669,9 +7235,17 @@
     </w:p>
     <w:p>
       <w:pPr>
-        <w:pStyle w:val="ListNumber"/>
         <w:spacing w:before="20" w:after="40"/>
-      </w:pPr>
+        <w:ind w:left="360"/>
+      </w:pPr>
+      <w:r>
+        <w:rPr>
+          <w:rFonts w:ascii="Times New Roman" w:hAnsi="Times New Roman"/>
+          <w:b/>
+          <w:sz w:val="20"/>
+        </w:rPr>
+        <w:t xml:space="preserve">1. </w:t>
+      </w:r>
       <w:r>
         <w:rPr>
           <w:rFonts w:ascii="Times New Roman" w:hAnsi="Times New Roman"/>
@@ -7690,9 +7264,17 @@
     </w:p>
     <w:p>
       <w:pPr>
-        <w:pStyle w:val="ListNumber"/>
         <w:spacing w:before="20" w:after="40"/>
-      </w:pPr>
+        <w:ind w:left="360"/>
+      </w:pPr>
+      <w:r>
+        <w:rPr>
+          <w:rFonts w:ascii="Times New Roman" w:hAnsi="Times New Roman"/>
+          <w:b/>
+          <w:sz w:val="20"/>
+        </w:rPr>
+        <w:t xml:space="preserve">2. </w:t>
+      </w:r>
       <w:r>
         <w:rPr>
           <w:rFonts w:ascii="Times New Roman" w:hAnsi="Times New Roman"/>
@@ -7711,14 +7293,14 @@
     </w:p>
     <w:p>
       <w:pPr>
-        <w:spacing w:before="120" w:after="120"/>
-        <w:jc w:val="center"/>
-      </w:pPr>
-      <w:r>
-        <w:rPr>
-          <w:color w:val="D2D2D2"/>
-        </w:rPr>
-        <w:t>_________________________________________________________________________________</w:t>
+        <w:spacing w:before="40" w:after="80" w:line="276" w:lineRule="auto"/>
+      </w:pPr>
+      <w:r>
+        <w:rPr>
+          <w:rFonts w:ascii="Times New Roman" w:hAnsi="Times New Roman"/>
+          <w:sz w:val="20"/>
+        </w:rPr>
+        <w:t>---</w:t>
       </w:r>
     </w:p>
     <w:p>
@@ -7780,14 +7362,14 @@
     </w:p>
     <w:p>
       <w:pPr>
-        <w:spacing w:before="120" w:after="120"/>
-        <w:jc w:val="center"/>
-      </w:pPr>
-      <w:r>
-        <w:rPr>
-          <w:color w:val="D2D2D2"/>
-        </w:rPr>
-        <w:t>_________________________________________________________________________________</w:t>
+        <w:spacing w:before="40" w:after="80" w:line="276" w:lineRule="auto"/>
+      </w:pPr>
+      <w:r>
+        <w:rPr>
+          <w:rFonts w:ascii="Times New Roman" w:hAnsi="Times New Roman"/>
+          <w:sz w:val="20"/>
+        </w:rPr>
+        <w:t>---</w:t>
       </w:r>
     </w:p>
     <w:p>
@@ -7819,14 +7401,14 @@
     </w:p>
     <w:p>
       <w:pPr>
-        <w:spacing w:before="120" w:after="120"/>
-        <w:jc w:val="center"/>
-      </w:pPr>
-      <w:r>
-        <w:rPr>
-          <w:color w:val="D2D2D2"/>
-        </w:rPr>
-        <w:t>_________________________________________________________________________________</w:t>
+        <w:spacing w:before="40" w:after="80" w:line="276" w:lineRule="auto"/>
+      </w:pPr>
+      <w:r>
+        <w:rPr>
+          <w:rFonts w:ascii="Times New Roman" w:hAnsi="Times New Roman"/>
+          <w:sz w:val="20"/>
+        </w:rPr>
+        <w:t>---</w:t>
       </w:r>
     </w:p>
     <w:p>
@@ -7862,15 +7444,7 @@
           <w:rFonts w:ascii="Times New Roman" w:hAnsi="Times New Roman"/>
           <w:sz w:val="20"/>
         </w:rPr>
-        <w:t xml:space="preserve">: </w:t>
-      </w:r>
-      <w:r>
-        <w:rPr>
-          <w:rFonts w:ascii="Times New Roman" w:hAnsi="Times New Roman"/>
-          <w:color w:val="A01E1E"/>
-          <w:sz w:val="20"/>
-        </w:rPr>
-        <w:t>17c136ef76dd0f82</w:t>
+        <w:t>: 17c136ef76dd0f82</w:t>
       </w:r>
     </w:p>
     <w:p>
@@ -7891,15 +7465,7 @@
           <w:rFonts w:ascii="Times New Roman" w:hAnsi="Times New Roman"/>
           <w:sz w:val="20"/>
         </w:rPr>
-        <w:t xml:space="preserve">: </w:t>
-      </w:r>
-      <w:r>
-        <w:rPr>
-          <w:rFonts w:ascii="Times New Roman" w:hAnsi="Times New Roman"/>
-          <w:color w:val="A01E1E"/>
-          <w:sz w:val="20"/>
-        </w:rPr>
-        <w:t>823334b</w:t>
+        <w:t>: 823334b</w:t>
       </w:r>
     </w:p>
     <w:p>
@@ -7920,22 +7486,7 @@
           <w:rFonts w:ascii="Times New Roman" w:hAnsi="Times New Roman"/>
           <w:sz w:val="20"/>
         </w:rPr>
-        <w:t xml:space="preserve">: </w:t>
-      </w:r>
-      <w:r>
-        <w:rPr>
-          <w:rFonts w:ascii="Times New Roman" w:hAnsi="Times New Roman"/>
-          <w:color w:val="A01E1E"/>
-          <w:sz w:val="20"/>
-        </w:rPr>
-        <w:t>1.0.0</w:t>
-      </w:r>
-      <w:r>
-        <w:rPr>
-          <w:rFonts w:ascii="Times New Roman" w:hAnsi="Times New Roman"/>
-          <w:sz w:val="20"/>
-        </w:rPr>
-        <w:t xml:space="preserve"> (Release Candidate 1 - RC1)</w:t>
+        <w:t>: 1.0.0 (Release Candidate 1 - RC1)</w:t>
       </w:r>
     </w:p>
     <w:p>
@@ -7956,27 +7507,19 @@
           <w:rFonts w:ascii="Times New Roman" w:hAnsi="Times New Roman"/>
           <w:sz w:val="20"/>
         </w:rPr>
-        <w:t xml:space="preserve">: </w:t>
-      </w:r>
-      <w:r>
-        <w:rPr>
-          <w:rFonts w:ascii="Times New Roman" w:hAnsi="Times New Roman"/>
-          <w:color w:val="A01E1E"/>
-          <w:sz w:val="20"/>
-        </w:rPr>
-        <w:t>backend/benchmark_reports/run_1785796639905/</w:t>
+        <w:t>: backend/benchmark_reports/run_1785796639905/</w:t>
       </w:r>
     </w:p>
     <w:p>
       <w:pPr>
-        <w:spacing w:before="120" w:after="120"/>
-        <w:jc w:val="center"/>
-      </w:pPr>
-      <w:r>
-        <w:rPr>
-          <w:color w:val="D2D2D2"/>
-        </w:rPr>
-        <w:t>_________________________________________________________________________________</w:t>
+        <w:spacing w:before="40" w:after="80" w:line="276" w:lineRule="auto"/>
+      </w:pPr>
+      <w:r>
+        <w:rPr>
+          <w:rFonts w:ascii="Times New Roman" w:hAnsi="Times New Roman"/>
+          <w:sz w:val="20"/>
+        </w:rPr>
+        <w:t>---</w:t>
       </w:r>
     </w:p>
     <w:p>
@@ -8026,22 +7569,7 @@
           <w:rFonts w:ascii="Times New Roman" w:hAnsi="Times New Roman"/>
           <w:sz w:val="20"/>
         </w:rPr>
-        <w:t xml:space="preserve">: How does </w:t>
-      </w:r>
-      <w:r>
-        <w:rPr>
-          <w:rFonts w:ascii="Consolas" w:hAnsi="Consolas"/>
-          <w:color w:val="A01E1E"/>
-          <w:sz w:val="19"/>
-        </w:rPr>
-        <w:t>CanonicalNormalizer</w:t>
-      </w:r>
-      <w:r>
-        <w:rPr>
-          <w:rFonts w:ascii="Times New Roman" w:hAnsi="Times New Roman"/>
-          <w:sz w:val="20"/>
-        </w:rPr>
-        <w:t xml:space="preserve"> handle unexpected date or numeric strings that do not match standard regex patterns?</w:t>
+        <w:t>: How does CanonicalNormalizer handle unexpected date or numeric strings that do not match standard regex patterns?</w:t>
       </w:r>
     </w:p>
     <w:p>
@@ -8061,37 +7589,7 @@
           <w:rFonts w:ascii="Times New Roman" w:hAnsi="Times New Roman"/>
           <w:sz w:val="20"/>
         </w:rPr>
-        <w:t xml:space="preserve">: When a field value does not match defined date or numerical patterns, </w:t>
-      </w:r>
-      <w:r>
-        <w:rPr>
-          <w:rFonts w:ascii="Consolas" w:hAnsi="Consolas"/>
-          <w:color w:val="A01E1E"/>
-          <w:sz w:val="19"/>
-        </w:rPr>
-        <w:t>CanonicalNormalizer</w:t>
-      </w:r>
-      <w:r>
-        <w:rPr>
-          <w:rFonts w:ascii="Times New Roman" w:hAnsi="Times New Roman"/>
-          <w:sz w:val="20"/>
-        </w:rPr>
-        <w:t xml:space="preserve"> falls back to </w:t>
-      </w:r>
-      <w:r>
-        <w:rPr>
-          <w:rFonts w:ascii="Consolas" w:hAnsi="Consolas"/>
-          <w:color w:val="A01E1E"/>
-          <w:sz w:val="19"/>
-        </w:rPr>
-        <w:t>StringNormalizer.normalize(val, true)</w:t>
-      </w:r>
-      <w:r>
-        <w:rPr>
-          <w:rFonts w:ascii="Times New Roman" w:hAnsi="Times New Roman"/>
-          <w:sz w:val="20"/>
-        </w:rPr>
-        <w:t>. This pipeline trims whitespace, collapses multiple internal spaces, and lowercases string characters, ensuring fair evaluation without pipeline failure.</w:t>
+        <w:t>: When a field value does not match defined date or numerical patterns, CanonicalNormalizer falls back to StringNormalizer.normalize(val, true). This pipeline trims whitespace, collapses multiple internal spaces, and lowercases string characters, ensuring fair evaluation without pipeline failure.</w:t>
       </w:r>
     </w:p>
     <w:p>
@@ -8146,22 +7644,7 @@
           <w:rFonts w:ascii="Times New Roman" w:hAnsi="Times New Roman"/>
           <w:sz w:val="20"/>
         </w:rPr>
-        <w:t xml:space="preserve">: </w:t>
-      </w:r>
-      <w:r>
-        <w:rPr>
-          <w:rFonts w:ascii="Consolas" w:hAnsi="Consolas"/>
-          <w:color w:val="A01E1E"/>
-          <w:sz w:val="19"/>
-        </w:rPr>
-        <w:t>BenchmarkRunner</w:t>
-      </w:r>
-      <w:r>
-        <w:rPr>
-          <w:rFonts w:ascii="Times New Roman" w:hAnsi="Times New Roman"/>
-          <w:sz w:val="20"/>
-        </w:rPr>
-        <w:t xml:space="preserve"> implements </w:t>
+        <w:t xml:space="preserve">: BenchmarkRunner implements </w:t>
       </w:r>
       <w:r>
         <w:rPr>
@@ -8177,94 +7660,19 @@
           <w:rFonts w:ascii="Times New Roman" w:hAnsi="Times New Roman"/>
           <w:sz w:val="20"/>
         </w:rPr>
-        <w:t xml:space="preserve"> linear dataset processing with worker pool concurrency (</w:t>
-      </w:r>
-      <w:r>
-        <w:rPr>
-          <w:rFonts w:ascii="Consolas" w:hAnsi="Consolas"/>
-          <w:color w:val="A01E1E"/>
-          <w:sz w:val="19"/>
-        </w:rPr>
-        <w:t>concurrency: 4</w:t>
-      </w:r>
-      <w:r>
-        <w:rPr>
-          <w:rFonts w:ascii="Times New Roman" w:hAnsi="Times New Roman"/>
-          <w:sz w:val="20"/>
-        </w:rPr>
-        <w:t>) and automatic checkpointing (</w:t>
-      </w:r>
-      <w:r>
-        <w:rPr>
-          <w:rFonts w:ascii="Consolas" w:hAnsi="Consolas"/>
-          <w:color w:val="A01E1E"/>
-          <w:sz w:val="19"/>
-        </w:rPr>
-        <w:t>checkpoint.json</w:t>
-      </w:r>
-      <w:r>
-        <w:rPr>
-          <w:rFonts w:ascii="Times New Roman" w:hAnsi="Times New Roman"/>
-          <w:sz w:val="20"/>
-        </w:rPr>
-        <w:t xml:space="preserve">). In large-scale evaluation runs, </w:t>
-      </w:r>
-      <w:r>
-        <w:rPr>
-          <w:rFonts w:ascii="Consolas" w:hAnsi="Consolas"/>
-          <w:color w:val="A01E1E"/>
-          <w:sz w:val="19"/>
-        </w:rPr>
-        <w:t>BenchmarkRunner</w:t>
-      </w:r>
-      <w:r>
-        <w:rPr>
-          <w:rFonts w:ascii="Times New Roman" w:hAnsi="Times New Roman"/>
-          <w:sz w:val="20"/>
-        </w:rPr>
-        <w:t xml:space="preserve"> updates </w:t>
-      </w:r>
-      <w:r>
-        <w:rPr>
-          <w:rFonts w:ascii="Consolas" w:hAnsi="Consolas"/>
-          <w:color w:val="A01E1E"/>
-          <w:sz w:val="19"/>
-        </w:rPr>
-        <w:t>checkpoint.json</w:t>
-      </w:r>
-      <w:r>
-        <w:rPr>
-          <w:rFonts w:ascii="Times New Roman" w:hAnsi="Times New Roman"/>
-          <w:sz w:val="20"/>
-        </w:rPr>
-        <w:t xml:space="preserve"> after every batch increment. If an execution is interrupted, the runner loads </w:t>
-      </w:r>
-      <w:r>
-        <w:rPr>
-          <w:rFonts w:ascii="Consolas" w:hAnsi="Consolas"/>
-          <w:color w:val="A01E1E"/>
-          <w:sz w:val="19"/>
-        </w:rPr>
-        <w:t>completedSampleIds</w:t>
-      </w:r>
-      <w:r>
-        <w:rPr>
-          <w:rFonts w:ascii="Times New Roman" w:hAnsi="Times New Roman"/>
-          <w:sz w:val="20"/>
-        </w:rPr>
-        <w:t xml:space="preserve"> upon restart and continues evaluation without re-processing previously completed specimens.</w:t>
+        <w:t xml:space="preserve"> linear dataset processing with worker pool concurrency (concurrency: 4) and automatic checkpointing (checkpoint.json). In large-scale evaluation runs, BenchmarkRunner updates checkpoint.json after every batch increment. If an execution is interrupted, the runner loads completedSampleIds upon restart and continues evaluation without re-processing previously completed specimens.</w:t>
       </w:r>
     </w:p>
     <w:p>
       <w:pPr>
-        <w:spacing w:before="120" w:after="120"/>
-        <w:jc w:val="center"/>
-      </w:pPr>
-      <w:r>
-        <w:rPr>
-          <w:color w:val="D2D2D2"/>
-        </w:rPr>
-        <w:t>_________________________________________________________________________________</w:t>
+        <w:spacing w:before="40" w:after="80" w:line="276" w:lineRule="auto"/>
+      </w:pPr>
+      <w:r>
+        <w:rPr>
+          <w:rFonts w:ascii="Times New Roman" w:hAnsi="Times New Roman"/>
+          <w:sz w:val="20"/>
+        </w:rPr>
+        <w:t>---</w:t>
       </w:r>
     </w:p>
     <w:p>
@@ -8558,7 +7966,7 @@
         <w:color w:val="646464"/>
         <w:sz w:val="18"/>
       </w:rPr>
-      <w:t xml:space="preserve">IEEE TRANSACTIONS ON PATTERN ANALYSIS AND MACHINE INTELLIGENCE | Page </w:t>
+      <w:t xml:space="preserve">IEEE ACCESS | Volume 14, 2026 | Page </w:t>
     </w:r>
     <w:fldSimple w:instr="PAGE"/>
   </w:p>

</xml_diff>